<commit_message>
update the final project presentation
</commit_message>
<xml_diff>
--- a/In-Class_Lab_Guide_NCCU_ISS_2026.docx
+++ b/In-Class_Lab_Guide_NCCU_ISS_2026.docx
@@ -73,7 +73,10 @@
         </w:numPr>
       </w:pPr>
       <w:r>
-        <w:t xml:space="preserve">Students work in 4 teams (15 students split as three teams of 4 and one team of 3), seated together so they can collaborate and later present as a team.</w:t>
+        <w:rPr>
+          <w:b w:val="0"/>
+        </w:rPr>
+        <w:t>Each student works on their own individual project (about 8 students, so about 8 projects). Seat students so they can still talk to a neighbour and compare results.</w:t>
       </w:r>
     </w:p>
     <w:p>
@@ -84,7 +87,7 @@
         </w:numPr>
       </w:pPr>
       <w:r>
-        <w:t>Days 1 to 5 are hands-on labs (below). Days 3 to 5 build one final project (a topic chatbot that answers from your own documents), which teams present on Day 6.</w:t>
+        <w:t>Days 1 to 5 are hands-on labs (below). Days 3 to 5 build one final project (a topic chatbot that answers from your own documents), which each student presents on Day 6.</w:t>
       </w:r>
     </w:p>
     <w:p>
@@ -156,7 +159,10 @@
         </w:numPr>
       </w:pPr>
       <w:r>
-        <w:t xml:space="preserve">0:10–0:15 Form the 4 teams and choose a team name.</w:t>
+        <w:rPr>
+          <w:b w:val="0"/>
+        </w:rPr>
+        <w:t>0:10–0:15 Quick round of introductions; each student will build their own project across Days 3 to 5.</w:t>
       </w:r>
     </w:p>
     <w:p>
@@ -321,6 +327,20 @@
       <w:r>
         <w:t xml:space="preserve">Google Colab (pre-built notebook, mostly run-only with clearly marked edit cells); Fashion-MNIST dataset.</w:t>
       </w:r>
+      <w:r>
+        <w:t xml:space="preserve"> Lab notebook: </w:t>
+      </w:r>
+      <w:hyperlink r:id="rId9">
+        <w:r>
+          <w:rPr>
+            <w:rStyle w:val="Hyperlink"/>
+          </w:rPr>
+          <w:t xml:space="preserve">Fashion-MNIST Colab</w:t>
+        </w:r>
+      </w:hyperlink>
+      <w:r>
+        <w:t>.</w:t>
+      </w:r>
     </w:p>
     <w:p>
       <w:pPr>
@@ -385,7 +405,10 @@
         </w:numPr>
       </w:pPr>
       <w:r>
-        <w:t>1:05–1:15 Compare results across groups; discuss overfitting.</w:t>
+        <w:rPr>
+          <w:b w:val="0"/>
+        </w:rPr>
+        <w:t>1:05–1:15 Compare results with your neighbours; discuss overfitting.</w:t>
       </w:r>
     </w:p>
     <w:p>
@@ -535,7 +558,7 @@
       </w:r>
       <w:r>
         <w:rPr/>
-        <w:t>Learn to steer a language model with prompt engineering, then pick your team's final-project topic and draft its system prompt. Days 3 to 5 build one project: a topic chatbot that answers from documents you provide (a RAG app), presented on Day 6.</w:t>
+        <w:t>Learn to steer a language model with prompt engineering, then pick your own final-project topic and draft its system prompt. Days 3 to 5 build one project: a topic chatbot that answers from documents you provide (a RAG app), presented on Day 6.</w:t>
       </w:r>
     </w:p>
     <w:p>
@@ -550,7 +573,7 @@
       </w:r>
       <w:r>
         <w:rPr/>
-        <w:t>Google Colab; a free OpenRouter API key (openrouter.ai); free models mistralai/mistral-7b-instruct:free and google/gemma-3-12b-it:free. Example and homework-template Colab notebooks are linked on the course website.</w:t>
+        <w:t>Google Colab; a free OpenRouter API key (openrouter.ai); free models google/gemma-4-31b-it:free and openai/gpt-oss-20b:free. Example and homework-template Colab notebooks are linked on the course website.</w:t>
       </w:r>
     </w:p>
     <w:p>
@@ -609,7 +632,7 @@
       </w:pPr>
       <w:r>
         <w:rPr/>
-        <w:t xml:space="preserve">0:50–1:10 As a team, choose your final-project topic (be creative; it can relate to your field) and draft a system prompt that uses at least two techniques.</w:t>
+        <w:t>0:50–1:10 Choose your final-project topic (be creative; it can relate to your field) and draft a system prompt that uses at least two techniques.</w:t>
       </w:r>
     </w:p>
     <w:p>
@@ -683,7 +706,7 @@
       </w:r>
       <w:r>
         <w:rPr/>
-        <w:t>Your team's project topic and a first system prompt using at least two techniques, plus a short note on the difference prompt engineering made. Remove your API key before sharing the Colab link.</w:t>
+        <w:t>Your your project topic and a first system prompt using at least two techniques, plus a short note on the difference prompt engineering made. Remove your API key before sharing the Colab link.</w:t>
       </w:r>
     </w:p>
     <w:p>
@@ -1054,7 +1077,7 @@
         <w:rPr>
           <w:b/>
         </w:rPr>
-        <w:t xml:space="preserve">Day 6 (7/28): Group Presentations</w:t>
+        <w:t>Day 6 (7/28): Final Presentations</w:t>
       </w:r>
     </w:p>
     <w:p>
@@ -1062,7 +1085,7 @@
         <w:pStyle w:val="BodyText"/>
       </w:pPr>
       <w:r>
-        <w:t>Each of the 4 teams presents its final project: the topic chatbot (a Gradio RAG app) built across Days 3 to 5, with a poster covering the topic, the source texts, the system prompt, and one limitation or guardrail. Plan on about 7 minutes of talk plus 3 minutes of Q&amp;A per team; a live demo of the app is encouraged.</w:t>
+        <w:t>Each student presents their own final project: the topic chatbot (a Gradio RAG app) built across Days 3 to 5, with a poster covering the topic, the source texts, the system prompt, and one limitation or guardrail. Plan on about 7 minutes of talk plus 3 minutes of Q&amp;A per student (10 minutes total); a live demo of the app is encouraged.</w:t>
       </w:r>
     </w:p>
     <w:p>
@@ -1095,7 +1118,7 @@
         </w:numPr>
       </w:pPr>
       <w:r>
-        <w:t>0:08–0:58 Four team presentations, about 10 minutes each (7 minutes talk, 3 minutes Q&amp;A).</w:t>
+        <w:t>0:08–0:48 Presentations 1–4, 10 minutes each (7 minutes talk, 3 minutes Q&amp;A).</w:t>
       </w:r>
     </w:p>
     <w:p>
@@ -1106,6 +1129,50 @@
         </w:numPr>
       </w:pPr>
       <w:r>
+        <w:t>0:48–0:58 Break.</w:t>
+      </w:r>
+    </w:p>
+    <w:p>
+      <w:pPr>
+        <w:numPr>
+          <w:ilvl w:val="0"/>
+          <w:numId w:val="1018"/>
+        </w:numPr>
+      </w:pPr>
+      <w:r>
+        <w:t>0:58–1:38 Presentations 5–8, same format.</w:t>
+      </w:r>
+    </w:p>
+    <w:p>
+      <w:pPr>
+        <w:numPr>
+          <w:ilvl w:val="0"/>
+          <w:numId w:val="1018"/>
+        </w:numPr>
+      </w:pPr>
+      <w:r>
+        <w:t>1:38–1:50 Peer feedback forms and short instructor comments.</w:t>
+      </w:r>
+    </w:p>
+    <w:p>
+      <w:pPr>
+        <w:numPr>
+          <w:ilvl w:val="0"/>
+          <w:numId w:val="1018"/>
+        </w:numPr>
+      </w:pPr>
+      <w:r>
+        <w:t>1:50–2:00 Course wrap-up and final reflection.</w:t>
+      </w:r>
+    </w:p>
+    <w:p>
+      <w:pPr>
+        <w:numPr>
+          <w:ilvl w:val="0"/>
+          <w:numId w:val="1018"/>
+        </w:numPr>
+      </w:pPr>
+      <w:r>
         <w:t>0:58–1:10 Peer feedback forms and short instructor comments.</w:t>
       </w:r>
     </w:p>
@@ -1139,7 +1206,10 @@
         </w:numPr>
       </w:pPr>
       <w:r>
-        <w:t xml:space="preserve">Title and team members.</w:t>
+        <w:rPr>
+          <w:b w:val="0"/>
+        </w:rPr>
+        <w:t>Title and your name.</w:t>
       </w:r>
     </w:p>
     <w:p>
@@ -1304,7 +1374,7 @@
         <w:rPr>
           <w:b/>
         </w:rPr>
-        <w:t xml:space="preserve">Peer feedback form (one per team, per audience member)</w:t>
+        <w:t>Peer feedback form (one per presenter, per audience member)</w:t>
       </w:r>
     </w:p>
     <w:p>
@@ -1315,7 +1385,10 @@
         </w:numPr>
       </w:pPr>
       <w:r>
-        <w:t xml:space="preserve">Two things this team did well.</w:t>
+        <w:rPr>
+          <w:b w:val="0"/>
+        </w:rPr>
+        <w:t>Two things this presenter did well.</w:t>
       </w:r>
     </w:p>
     <w:p>

</xml_diff>

<commit_message>
update the final project presentation form
</commit_message>
<xml_diff>
--- a/In-Class_Lab_Guide_NCCU_ISS_2026.docx
+++ b/In-Class_Lab_Guide_NCCU_ISS_2026.docx
@@ -1195,7 +1195,18 @@
         <w:rPr>
           <w:b/>
         </w:rPr>
-        <w:t xml:space="preserve">Slide outline (1-page template)</w:t>
+        <w:t>What your presentation must cover</w:t>
+      </w:r>
+    </w:p>
+    <w:p>
+      <w:pPr>
+        <w:pStyle w:val="FirstParagraph"/>
+      </w:pPr>
+      <w:r>
+        <w:rPr>
+          <w:b w:val="0"/>
+        </w:rPr>
+        <w:t>Your visual aid is a one-page poster (printed, or shown as a single slide). A full slide deck is optional: most students show the poster and demo the app live. Cover these points:</w:t>
       </w:r>
     </w:p>
     <w:p>
@@ -1209,7 +1220,7 @@
         <w:rPr>
           <w:b w:val="0"/>
         </w:rPr>
-        <w:t>Title and your name.</w:t>
+        <w:t>Your name and project title.</w:t>
       </w:r>
     </w:p>
     <w:p>
@@ -1220,7 +1231,10 @@
         </w:numPr>
       </w:pPr>
       <w:r>
-        <w:t xml:space="preserve">The AI application or issue you chose.</w:t>
+        <w:rPr>
+          <w:b w:val="0"/>
+        </w:rPr>
+        <w:t>Your topic, and why you chose it.</w:t>
       </w:r>
     </w:p>
     <w:p>
@@ -1231,7 +1245,10 @@
         </w:numPr>
       </w:pPr>
       <w:r>
-        <w:t xml:space="preserve">How it works, in plain language.</w:t>
+        <w:rPr>
+          <w:b w:val="0"/>
+        </w:rPr>
+        <w:t>The source texts behind your chatbot.</w:t>
       </w:r>
     </w:p>
     <w:p>
@@ -1242,7 +1259,10 @@
         </w:numPr>
       </w:pPr>
       <w:r>
-        <w:t xml:space="preserve">Why it matters: its value or benefit.</w:t>
+        <w:rPr>
+          <w:b w:val="0"/>
+        </w:rPr>
+        <w:t>How it works, in plain language (retrieve → augment → generate).</w:t>
       </w:r>
     </w:p>
     <w:p>
@@ -1253,7 +1273,10 @@
         </w:numPr>
       </w:pPr>
       <w:r>
-        <w:t xml:space="preserve">Risks and ethics: misinformation, bias, trust, or privacy.</w:t>
+        <w:rPr>
+          <w:b w:val="0"/>
+        </w:rPr>
+        <w:t>Your system prompt and guardrail.</w:t>
       </w:r>
     </w:p>
     <w:p>
@@ -1264,7 +1287,10 @@
         </w:numPr>
       </w:pPr>
       <w:r>
-        <w:t xml:space="preserve">Connection to course concepts and your own hands-on results.</w:t>
+        <w:rPr>
+          <w:b w:val="0"/>
+        </w:rPr>
+        <w:t>What you found when you tested it, including one limitation.</w:t>
       </w:r>
     </w:p>
     <w:p>
@@ -1275,7 +1301,24 @@
         </w:numPr>
       </w:pPr>
       <w:r>
-        <w:t xml:space="preserve">Conclusion and questions for the audience.</w:t>
+        <w:rPr>
+          <w:b w:val="0"/>
+        </w:rPr>
+        <w:t>One ethical or social implication.</w:t>
+      </w:r>
+    </w:p>
+    <w:p>
+      <w:pPr>
+        <w:numPr>
+          <w:ilvl w:val="0"/>
+          <w:numId w:val="1019"/>
+        </w:numPr>
+      </w:pPr>
+      <w:r>
+        <w:rPr>
+          <w:b w:val="0"/>
+        </w:rPr>
+        <w:t>Live demo, then questions for the audience.</w:t>
       </w:r>
     </w:p>
     <w:p>

</xml_diff>